<commit_message>
chore: sync portfolio content with new CV
</commit_message>
<xml_diff>
--- a/public/cv-salma-fennane.docx
+++ b/public/cv-salma-fennane.docx
@@ -15,7 +15,7 @@
         <w:spacing w:after="120"/>
       </w:pPr>
       <w:r>
-        <w:t xml:space="preserve">Data Scientist &amp; AI Researcher</w:t>
+        <w:t xml:space="preserve">Data Scientist</w:t>
       </w:r>
     </w:p>
     <w:p>
@@ -49,46 +49,46 @@
         <w:spacing w:after="100"/>
       </w:pPr>
       <w:r>
-        <w:t xml:space="preserve">Data Scientist passionnée par la résolution de problèmes complexes à l'aide du Machine Learning, du Deep Learning et de l'Intelligence Artificielle. Mon expertise couvre l'ensemble du pipeline de données, de la collecte et du nettoyage à la modélisation et au déploiement.</w:t>
-      </w:r>
-    </w:p>
-    <w:p>
-      <w:pPr>
-        <w:pStyle w:val="ListParagraph"/>
-        <w:numPr>
-          <w:ilvl w:val="0"/>
-          <w:numId w:val="1"/>
-        </w:numPr>
-        <w:spacing w:after="100"/>
-      </w:pPr>
-      <w:r>
-        <w:t xml:space="preserve">Actuellement doctorante en première année en intelligence artificielle appliquée à la médecine, je combine recherche académique et enseignement en Data Science. Mon parcours m'a permis de développer une solide maîtrise des outils et frameworks modernes de l'IA.</w:t>
-      </w:r>
-    </w:p>
-    <w:p>
-      <w:pPr>
-        <w:pStyle w:val="ListParagraph"/>
-        <w:numPr>
-          <w:ilvl w:val="0"/>
-          <w:numId w:val="1"/>
-        </w:numPr>
-        <w:spacing w:after="100"/>
-      </w:pPr>
-      <w:r>
-        <w:t xml:space="preserve">Motivée par l'optimisation des processus et l'innovation, je cherche constamment à mettre mes compétences techniques au service de projets stimulants ayant un impact concret. Mon expérience d'enseignante me permet également de vulgariser des concepts complexes.</w:t>
-      </w:r>
-    </w:p>
-    <w:p>
-      <w:pPr>
-        <w:pStyle w:val="ListParagraph"/>
-        <w:numPr>
-          <w:ilvl w:val="0"/>
-          <w:numId w:val="1"/>
-        </w:numPr>
-        <w:spacing w:after="100"/>
-      </w:pPr>
-      <w:r>
-        <w:t xml:space="preserve">Je maîtrise un large éventail de technologies allant du Machine Learning classique au Deep Learning, en passant par le Big Data, la Business Intelligence et le développement web. Je suis toujours à la recherche de nouvelles opportunités de collaboration et d'apprentissage.</w:t>
+        <w:t xml:space="preserve">Data Scientist passionnée par la résolution de problèmes complexes en utilisant le Machine Learning, le Deep Learning et l'Intelligence Artificielle.</w:t>
+      </w:r>
+    </w:p>
+    <w:p>
+      <w:pPr>
+        <w:pStyle w:val="ListParagraph"/>
+        <w:numPr>
+          <w:ilvl w:val="0"/>
+          <w:numId w:val="1"/>
+        </w:numPr>
+        <w:spacing w:after="100"/>
+      </w:pPr>
+      <w:r>
+        <w:t xml:space="preserve">Actuellement doctorante en première année en Intelligence Artificielle appliquée à la médecine, je combine recherche académique et enseignement en Data Science.</w:t>
+      </w:r>
+    </w:p>
+    <w:p>
+      <w:pPr>
+        <w:pStyle w:val="ListParagraph"/>
+        <w:numPr>
+          <w:ilvl w:val="0"/>
+          <w:numId w:val="1"/>
+        </w:numPr>
+        <w:spacing w:after="100"/>
+      </w:pPr>
+      <w:r>
+        <w:t xml:space="preserve">Motivée par l'optimisation des processus d'affaires et l'innovation, je cherche à mettre mes compétences techniques au service de projets innovants et stimulants.</w:t>
+      </w:r>
+    </w:p>
+    <w:p>
+      <w:pPr>
+        <w:pStyle w:val="ListParagraph"/>
+        <w:numPr>
+          <w:ilvl w:val="0"/>
+          <w:numId w:val="1"/>
+        </w:numPr>
+        <w:spacing w:after="100"/>
+      </w:pPr>
+      <w:r>
+        <w:t xml:space="preserve">Mon expertise couvre la préparation des données, la modélisation, l'évaluation et le déploiement de solutions data en environnement réel.</w:t>
       </w:r>
     </w:p>
     <w:p>
@@ -127,7 +127,7 @@
         <w:spacing w:after="100"/>
       </w:pPr>
       <w:r>
-        <w:t xml:space="preserve">Langages de Programmation: Python, Java, C++, C, Matlab, JEE, JSON, Scala</w:t>
+        <w:t xml:space="preserve">Langages de Programmation: Python, Java, C++, C, Matlab, JEE, JSON</w:t>
       </w:r>
     </w:p>
     <w:p>
@@ -153,7 +153,7 @@
         <w:spacing w:after="100"/>
       </w:pPr>
       <w:r>
-        <w:t xml:space="preserve">Business Intelligence &amp; Big Data: ETL, OLAP, MDX, SSIS, SSAS, Power BI, Talend, Datawarehouse, Hadoop, Kafka, Kibana</w:t>
+        <w:t xml:space="preserve">Business Intelligence &amp; Big Data: ETL, OLAP, MDX, SSIS, SSAS, Power BI, Talend, Datawarehouse, Hadoop, Scala, Kafka, Kibana</w:t>
       </w:r>
     </w:p>
     <w:p>
@@ -288,6 +288,19 @@
     </w:p>
     <w:p>
       <w:pPr>
+        <w:pStyle w:val="ListParagraph"/>
+        <w:numPr>
+          <w:ilvl w:val="0"/>
+          <w:numId w:val="1"/>
+        </w:numPr>
+        <w:spacing w:after="100"/>
+      </w:pPr>
+      <w:r>
+        <w:t xml:space="preserve">Esprit Critique: Capacité à interpréter des données complexes et à structurer une analyse fiable.</w:t>
+      </w:r>
+    </w:p>
+    <w:p>
+      <w:pPr>
         <w:pStyle w:val="Heading1"/>
         <w:spacing w:after="120" w:before="240"/>
       </w:pPr>
@@ -322,20 +335,20 @@
         <w:spacing w:after="100"/>
       </w:pPr>
       <w:r>
-        <w:t xml:space="preserve">2022 – 2024 - Master Recherche, Informatique Décisionnelle et Vision Intelligente (MIDVI), Faculté Des Sciences Dhar El Mahraz. Formation avancée en informatique décisionnelle, vision par ordinateur, machine learning et data science. Projet de fin d'études sur la détection d'intrusion par réseaux de neurones profonds.</w:t>
-      </w:r>
-    </w:p>
-    <w:p>
-      <w:pPr>
-        <w:pStyle w:val="ListParagraph"/>
-        <w:numPr>
-          <w:ilvl w:val="0"/>
-          <w:numId w:val="1"/>
-        </w:numPr>
-        <w:spacing w:after="100"/>
-      </w:pPr>
-      <w:r>
-        <w:t xml:space="preserve">2019 – 2022 - Licence, Sciences Mathématiques et Informatiques, Faculté Des Sciences Dhar El Mahraz. Formation fondamentale en mathématiques et informatique. Projet de fin d'études sur la détection d'anomalies dans les images par Machine Learning.</w:t>
+        <w:t xml:space="preserve">2024 - Master Recherche, Informatique Décisionnelle et Vision Intelligente (MIDVI), Faculté Des Sciences Dhar El Mahraz. Formation avancée en informatique décisionnelle, vision par ordinateur, machine learning et data science. Projet de fin d'études sur la détection d'intrusion par réseaux de neurones profonds.</w:t>
+      </w:r>
+    </w:p>
+    <w:p>
+      <w:pPr>
+        <w:pStyle w:val="ListParagraph"/>
+        <w:numPr>
+          <w:ilvl w:val="0"/>
+          <w:numId w:val="1"/>
+        </w:numPr>
+        <w:spacing w:after="100"/>
+      </w:pPr>
+      <w:r>
+        <w:t xml:space="preserve">2022 - Licence, Sciences Mathématiques et Informatiques, Faculté Des Sciences Dhar El Mahraz. Formation fondamentale en mathématiques et informatique. Projet de fin d'études sur la détection d'anomalies dans les images par Machine Learning.</w:t>
       </w:r>
     </w:p>
     <w:p>

</xml_diff>